<commit_message>
Refine focused portfolios and resumes
</commit_message>
<xml_diff>
--- a/Gbengaayo_Olawale_Resume.docx
+++ b/Gbengaayo_Olawale_Resume.docx
@@ -28,59 +28,6 @@
             <w:pPr>
               <w:jc w:val="center"/>
             </w:pPr>
-            <w:r>
-              <w:rPr>
-                <w:noProof/>
-              </w:rPr>
-              <w:drawing>
-                <wp:inline distT="0" distB="0" distL="0" distR="0" wp14:anchorId="39B7DA11" wp14:editId="07917960">
-                  <wp:extent cx="1098389" cy="1652954"/>
-                  <wp:effectExtent l="0" t="0" r="6985" b="4445"/>
-                  <wp:docPr id="1" name="Picture 1"/>
-                  <wp:cNvGraphicFramePr>
-                    <a:graphicFrameLocks xmlns:a="http://schemas.openxmlformats.org/drawingml/2006/main" noChangeAspect="1"/>
-                  </wp:cNvGraphicFramePr>
-                  <a:graphic xmlns:a="http://schemas.openxmlformats.org/drawingml/2006/main">
-                    <a:graphicData uri="http://schemas.openxmlformats.org/drawingml/2006/picture">
-                      <pic:pic xmlns:pic="http://schemas.openxmlformats.org/drawingml/2006/picture">
-                        <pic:nvPicPr>
-                          <pic:cNvPr id="0" name="Picture 1"/>
-                          <pic:cNvPicPr>
-                            <a:picLocks noChangeAspect="1" noChangeArrowheads="1"/>
-                          </pic:cNvPicPr>
-                        </pic:nvPicPr>
-                        <pic:blipFill>
-                          <a:blip r:embed="rId6">
-                            <a:extLst>
-                              <a:ext uri="{28A0092B-C50C-407E-A947-70E740481C1C}">
-                                <a14:useLocalDpi xmlns:a14="http://schemas.microsoft.com/office/drawing/2010/main" val="0"/>
-                              </a:ext>
-                            </a:extLst>
-                          </a:blip>
-                          <a:srcRect/>
-                          <a:stretch>
-                            <a:fillRect/>
-                          </a:stretch>
-                        </pic:blipFill>
-                        <pic:spPr bwMode="auto">
-                          <a:xfrm>
-                            <a:off x="0" y="0"/>
-                            <a:ext cx="1113366" cy="1675493"/>
-                          </a:xfrm>
-                          <a:prstGeom prst="rect">
-                            <a:avLst/>
-                          </a:prstGeom>
-                          <a:noFill/>
-                          <a:ln>
-                            <a:noFill/>
-                          </a:ln>
-                        </pic:spPr>
-                      </pic:pic>
-                    </a:graphicData>
-                  </a:graphic>
-                </wp:inline>
-              </w:drawing>
-            </w:r>
           </w:p>
           <w:p>
             <w:r>
@@ -553,6 +500,13 @@
             </w:r>
           </w:p>
           <w:p>
+            <w:pPr>
+              <w:rPr>
+                <w:rFonts w:ascii="Calibri" w:hAnsi="Calibri"/>
+                <w:color w:val="282828"/>
+                <w:sz w:val="17"/>
+              </w:rPr>
+            </w:pPr>
             <w:r>
               <w:rPr>
                 <w:rFonts w:ascii="Calibri" w:hAnsi="Calibri"/>
@@ -560,6 +514,43 @@
                 <w:sz w:val="17"/>
               </w:rPr>
               <w:t>• Supported the development of a practical, user-friendly experience for digital financial tools.</w:t>
+            </w:r>
+          </w:p>
+          <w:p>
+            <w:pPr>
+              <w:rPr>
+                <w:rFonts w:ascii="Calibri" w:hAnsi="Calibri"/>
+                <w:color w:val="282828"/>
+                <w:sz w:val="17"/>
+              </w:rPr>
+            </w:pPr>
+          </w:p>
+          <w:p>
+            <w:r>
+              <w:rPr>
+                <w:rFonts w:ascii="Calibri" w:hAnsi="Calibri"/>
+                <w:color w:val="282828"/>
+                <w:sz w:val="17"/>
+              </w:rPr>
+              <w:t xml:space="preserve">My </w:t>
+            </w:r>
+            <w:proofErr w:type="spellStart"/>
+            <w:r>
+              <w:rPr>
+                <w:rFonts w:ascii="Calibri" w:hAnsi="Calibri"/>
+                <w:color w:val="282828"/>
+                <w:sz w:val="17"/>
+              </w:rPr>
+              <w:t>Portifolio</w:t>
+            </w:r>
+            <w:proofErr w:type="spellEnd"/>
+            <w:r>
+              <w:rPr>
+                <w:rFonts w:ascii="Calibri" w:hAnsi="Calibri"/>
+                <w:color w:val="282828"/>
+                <w:sz w:val="17"/>
+              </w:rPr>
+              <w:t>: https://gbengaayo.vercel.app</w:t>
             </w:r>
           </w:p>
         </w:tc>
@@ -12159,6 +12150,29 @@
       </w:tcPr>
     </w:tblStylePr>
   </w:style>
+  <w:style w:type="character" w:styleId="Hyperlink">
+    <w:name w:val="Hyperlink"/>
+    <w:basedOn w:val="DefaultParagraphFont"/>
+    <w:uiPriority w:val="99"/>
+    <w:unhideWhenUsed/>
+    <w:rsid w:val="00691077"/>
+    <w:rPr>
+      <w:color w:val="0000FF" w:themeColor="hyperlink"/>
+      <w:u w:val="single"/>
+    </w:rPr>
+  </w:style>
+  <w:style w:type="character" w:styleId="UnresolvedMention">
+    <w:name w:val="Unresolved Mention"/>
+    <w:basedOn w:val="DefaultParagraphFont"/>
+    <w:uiPriority w:val="99"/>
+    <w:semiHidden/>
+    <w:unhideWhenUsed/>
+    <w:rsid w:val="00691077"/>
+    <w:rPr>
+      <w:color w:val="605E5C"/>
+      <w:shd w:val="clear" w:color="auto" w:fill="E1DFDD"/>
+    </w:rPr>
+  </w:style>
 </w:styles>
 </file>
 

</xml_diff>